<commit_message>
docs: shorten weekly progress report
</commit_message>
<xml_diff>
--- a/2026秋-工作周报@姓名.docx
+++ b/2026秋-工作周报@姓名.docx
@@ -5,7 +5,7 @@
     <w:tbl>
       <w:tblPr>
         <w:tblStyle w:val="6"/>
-        <w:tblpPr w:leftFromText="180" w:rightFromText="180" w:vertAnchor="page" w:horzAnchor="margin" w:tblpY="2011"/>
+        <w:tblpPr w:leftFromText="180" w:rightFromText="180" w:vertAnchor="page" w:horzAnchor="margin" w:tblpY="600"/>
         <w:tblW w:w="0" w:type="auto"/>
         <w:tblInd w:w="0" w:type="dxa"/>
         <w:tblBorders>
@@ -155,24 +155,31 @@
           <w:tcPr>
             <w:tcW w:w="14000" w:type="dxa"/>
             <w:gridSpan w:val="5"/>
-          </w:tcPr>
-          <w:p>
-            <w:pPr>
-              <w:jc w:val="left"/>
-              <w:rPr>
-                <w:b/>
-              </w:rPr>
-            </w:pPr>
-            <w:r>
-              <w:rPr>
-                <w:rFonts w:hint="eastAsia" w:eastAsia="Noto Sans CJK SC"/>
-                <w:b/>
+            <w:tcMar>
+              <w:top w:w="40" w:type="dxa"/>
+              <w:bottom w:w="40" w:type="dxa"/>
+            </w:tcMar>
+          </w:tcPr>
+          <w:p>
+            <w:pPr>
+              <w:spacing w:before="0" w:after="0" w:line="260" w:lineRule="exact"/>
+              <w:jc w:val="left"/>
+              <w:rPr>
+                <w:b/>
+              </w:rPr>
+            </w:pPr>
+            <w:r>
+              <w:rPr>
+                <w:rFonts w:hint="eastAsia" w:eastAsia="Noto Sans CJK SC" w:ascii="Noto Sans CJK SC" w:hAnsi="Noto Sans CJK SC"/>
+                <w:b/>
+                <w:sz w:val="21"/>
               </w:rPr>
               <w:t>本学期工作计划：</w:t>
             </w:r>
           </w:p>
           <w:p>
             <w:pPr>
+              <w:spacing w:before="0" w:after="0" w:line="260" w:lineRule="exact"/>
               <w:jc w:val="left"/>
               <w:rPr>
                 <w:rFonts w:hint="eastAsia"/>
@@ -181,14 +188,16 @@
             </w:pPr>
             <w:r>
               <w:rPr>
-                <w:rFonts w:hint="eastAsia" w:eastAsia="Noto Sans CJK SC"/>
-                <w:b/>
+                <w:rFonts w:hint="eastAsia" w:eastAsia="Noto Sans CJK SC" w:ascii="Noto Sans CJK SC" w:hAnsi="Noto Sans CJK SC"/>
+                <w:b/>
+                <w:sz w:val="21"/>
               </w:rPr>
               <w:t>1、</w:t>
             </w:r>
           </w:p>
           <w:p>
             <w:pPr>
+              <w:spacing w:before="0" w:after="0" w:line="260" w:lineRule="exact"/>
               <w:jc w:val="left"/>
               <w:rPr>
                 <w:rFonts w:hint="eastAsia"/>
@@ -198,8 +207,9 @@
             </w:pPr>
             <w:r>
               <w:rPr>
-                <w:rFonts w:hint="eastAsia" w:eastAsia="Noto Sans CJK SC"/>
-                <w:b/>
+                <w:rFonts w:hint="eastAsia" w:eastAsia="Noto Sans CJK SC" w:ascii="Noto Sans CJK SC" w:hAnsi="Noto Sans CJK SC"/>
+                <w:b/>
+                <w:sz w:val="21"/>
                 <w:lang w:val="en-US" w:eastAsia="zh-CN"/>
               </w:rPr>
               <w:t>2、</w:t>
@@ -207,6 +217,7 @@
           </w:p>
           <w:p>
             <w:pPr>
+              <w:spacing w:before="0" w:after="0" w:line="260" w:lineRule="exact"/>
               <w:jc w:val="left"/>
               <w:rPr>
                 <w:rFonts w:hint="default"/>
@@ -216,8 +227,9 @@
             </w:pPr>
             <w:r>
               <w:rPr>
-                <w:rFonts w:hint="eastAsia" w:eastAsia="Noto Sans CJK SC"/>
-                <w:b/>
+                <w:rFonts w:hint="eastAsia" w:eastAsia="Noto Sans CJK SC" w:ascii="Noto Sans CJK SC" w:hAnsi="Noto Sans CJK SC"/>
+                <w:b/>
+                <w:sz w:val="21"/>
                 <w:lang w:val="en-US" w:eastAsia="zh-CN"/>
               </w:rPr>
               <w:t>3、</w:t>
@@ -246,35 +258,26 @@
           <w:tcPr>
             <w:tcW w:w="14000" w:type="dxa"/>
             <w:gridSpan w:val="5"/>
-          </w:tcPr>
-          <w:p>
-            <w:pPr>
-              <w:jc w:val="left"/>
-              <w:rPr>
-                <w:b/>
-              </w:rPr>
-            </w:pPr>
-            <w:r>
-              <w:rPr>
-                <w:rFonts w:hint="eastAsia" w:eastAsia="Noto Sans CJK SC"/>
-                <w:b/>
+            <w:tcMar>
+              <w:top w:w="40" w:type="dxa"/>
+              <w:bottom w:w="40" w:type="dxa"/>
+            </w:tcMar>
+          </w:tcPr>
+          <w:p>
+            <w:pPr>
+              <w:spacing w:before="0" w:after="0" w:line="260" w:lineRule="exact"/>
+              <w:jc w:val="left"/>
+              <w:rPr>
+                <w:b/>
+              </w:rPr>
+            </w:pPr>
+            <w:r>
+              <w:rPr>
+                <w:rFonts w:hint="eastAsia" w:eastAsia="Noto Sans CJK SC" w:ascii="Noto Sans CJK SC" w:hAnsi="Noto Sans CJK SC"/>
+                <w:b/>
+                <w:sz w:val="21"/>
               </w:rPr>
               <w:t>工作周报</w:t>
-            </w:r>
-          </w:p>
-          <w:p>
-            <w:pPr>
-              <w:spacing w:before="20" w:after="20" w:line="240" w:lineRule="auto"/>
-              <w:jc w:val="left"/>
-            </w:pPr>
-            <w:r>
-              <w:rPr>
-                <w:rFonts w:eastAsia="Noto Sans CJK SC"/>
-                <w:b/>
-                <w:color w:val="9C0006"/>
-                <w:sz w:val="18"/>
-              </w:rPr>
-              <w:t>模拟周报：工作进展为拟写内容，非实际完成记录；实验方案尚未执行。</w:t>
             </w:r>
           </w:p>
         </w:tc>
@@ -302,9 +305,14 @@
         <w:tc>
           <w:tcPr>
             <w:tcW w:w="817" w:type="dxa"/>
-          </w:tcPr>
-          <w:p>
-            <w:pPr>
+            <w:tcMar>
+              <w:top w:w="40" w:type="dxa"/>
+              <w:bottom w:w="40" w:type="dxa"/>
+            </w:tcMar>
+          </w:tcPr>
+          <w:p>
+            <w:pPr>
+              <w:spacing w:before="0" w:after="0" w:line="260" w:lineRule="exact"/>
               <w:ind w:firstLine="105" w:firstLineChars="50"/>
               <w:rPr>
                 <w:b/>
@@ -312,8 +320,9 @@
             </w:pPr>
             <w:r>
               <w:rPr>
-                <w:rFonts w:hint="eastAsia" w:eastAsia="Noto Sans CJK SC"/>
-                <w:b/>
+                <w:rFonts w:hint="eastAsia" w:eastAsia="Noto Sans CJK SC" w:ascii="Noto Sans CJK SC" w:hAnsi="Noto Sans CJK SC"/>
+                <w:b/>
+                <w:sz w:val="21"/>
               </w:rPr>
               <w:t>周数</w:t>
             </w:r>
@@ -322,9 +331,14 @@
         <w:tc>
           <w:tcPr>
             <w:tcW w:w="1418" w:type="dxa"/>
-          </w:tcPr>
-          <w:p>
-            <w:pPr>
+            <w:tcMar>
+              <w:top w:w="40" w:type="dxa"/>
+              <w:bottom w:w="40" w:type="dxa"/>
+            </w:tcMar>
+          </w:tcPr>
+          <w:p>
+            <w:pPr>
+              <w:spacing w:before="0" w:after="0" w:line="260" w:lineRule="exact"/>
               <w:jc w:val="center"/>
               <w:rPr>
                 <w:b/>
@@ -332,8 +346,9 @@
             </w:pPr>
             <w:r>
               <w:rPr>
-                <w:rFonts w:hint="eastAsia" w:eastAsia="Noto Sans CJK SC"/>
-                <w:b/>
+                <w:rFonts w:hint="eastAsia" w:eastAsia="Noto Sans CJK SC" w:ascii="Noto Sans CJK SC" w:hAnsi="Noto Sans CJK SC"/>
+                <w:b/>
+                <w:sz w:val="21"/>
               </w:rPr>
               <w:t>日期起止</w:t>
             </w:r>
@@ -342,9 +357,14 @@
         <w:tc>
           <w:tcPr>
             <w:tcW w:w="5032" w:type="dxa"/>
-          </w:tcPr>
-          <w:p>
-            <w:pPr>
+            <w:tcMar>
+              <w:top w:w="40" w:type="dxa"/>
+              <w:bottom w:w="40" w:type="dxa"/>
+            </w:tcMar>
+          </w:tcPr>
+          <w:p>
+            <w:pPr>
+              <w:spacing w:before="0" w:after="0" w:line="260" w:lineRule="exact"/>
               <w:jc w:val="center"/>
               <w:rPr>
                 <w:b/>
@@ -352,8 +372,9 @@
             </w:pPr>
             <w:r>
               <w:rPr>
-                <w:rFonts w:hint="eastAsia" w:eastAsia="Noto Sans CJK SC"/>
-                <w:b/>
+                <w:rFonts w:hint="eastAsia" w:eastAsia="Noto Sans CJK SC" w:ascii="Noto Sans CJK SC" w:hAnsi="Noto Sans CJK SC"/>
+                <w:b/>
+                <w:sz w:val="21"/>
               </w:rPr>
               <w:t>本周工作计划</w:t>
             </w:r>
@@ -362,9 +383,14 @@
         <w:tc>
           <w:tcPr>
             <w:tcW w:w="5032" w:type="dxa"/>
-          </w:tcPr>
-          <w:p>
-            <w:pPr>
+            <w:tcMar>
+              <w:top w:w="40" w:type="dxa"/>
+              <w:bottom w:w="40" w:type="dxa"/>
+            </w:tcMar>
+          </w:tcPr>
+          <w:p>
+            <w:pPr>
+              <w:spacing w:before="0" w:after="0" w:line="260" w:lineRule="exact"/>
               <w:jc w:val="center"/>
               <w:rPr>
                 <w:b/>
@@ -372,8 +398,9 @@
             </w:pPr>
             <w:r>
               <w:rPr>
-                <w:rFonts w:hint="eastAsia" w:eastAsia="Noto Sans CJK SC"/>
-                <w:b/>
+                <w:rFonts w:hint="eastAsia" w:eastAsia="Noto Sans CJK SC" w:ascii="Noto Sans CJK SC" w:hAnsi="Noto Sans CJK SC"/>
+                <w:b/>
+                <w:sz w:val="21"/>
               </w:rPr>
               <w:t>本周执行情况</w:t>
             </w:r>
@@ -382,9 +409,14 @@
         <w:tc>
           <w:tcPr>
             <w:tcW w:w="1701" w:type="dxa"/>
-          </w:tcPr>
-          <w:p>
-            <w:pPr>
+            <w:tcMar>
+              <w:top w:w="40" w:type="dxa"/>
+              <w:bottom w:w="40" w:type="dxa"/>
+            </w:tcMar>
+          </w:tcPr>
+          <w:p>
+            <w:pPr>
+              <w:spacing w:before="0" w:after="0" w:line="260" w:lineRule="exact"/>
               <w:jc w:val="center"/>
               <w:rPr>
                 <w:b/>
@@ -392,8 +424,9 @@
             </w:pPr>
             <w:r>
               <w:rPr>
-                <w:rFonts w:hint="eastAsia" w:eastAsia="Noto Sans CJK SC"/>
-                <w:b/>
+                <w:rFonts w:hint="eastAsia" w:eastAsia="Noto Sans CJK SC" w:ascii="Noto Sans CJK SC" w:hAnsi="Noto Sans CJK SC"/>
+                <w:b/>
+                <w:sz w:val="21"/>
               </w:rPr>
               <w:t>未完成原因</w:t>
             </w:r>
@@ -421,22 +454,21 @@
           <w:tcPr>
             <w:tcW w:w="817" w:type="dxa"/>
             <w:vAlign w:val="top"/>
-          </w:tcPr>
-          <w:p>
-            <w:pPr>
-              <w:keepNext w:val="0"/>
-              <w:widowControl/>
-              <w:spacing w:before="0" w:after="40" w:line="240" w:lineRule="auto"/>
+            <w:tcMar>
+              <w:top w:w="40" w:type="dxa"/>
+              <w:bottom w:w="40" w:type="dxa"/>
+            </w:tcMar>
+          </w:tcPr>
+          <w:p>
+            <w:pPr>
+              <w:spacing w:before="0" w:after="0" w:line="260" w:lineRule="exact"/>
               <w:jc w:val="center"/>
-              <w:rPr>
-                <w:b/>
-              </w:rPr>
-            </w:pPr>
-            <w:r>
-              <w:rPr>
-                <w:rFonts w:eastAsia="Noto Sans CJK SC"/>
-                <w:b/>
-                <w:sz w:val="20"/>
+            </w:pPr>
+            <w:r>
+              <w:rPr>
+                <w:rFonts w:ascii="Noto Sans CJK SC" w:hAnsi="Noto Sans CJK SC" w:eastAsia="Noto Sans CJK SC"/>
+                <w:b/>
+                <w:sz w:val="21"/>
               </w:rPr>
               <w:t>上周</w:t>
             </w:r>
@@ -446,22 +478,21 @@
           <w:tcPr>
             <w:tcW w:w="1418" w:type="dxa"/>
             <w:vAlign w:val="top"/>
-          </w:tcPr>
-          <w:p>
-            <w:pPr>
-              <w:keepNext w:val="0"/>
-              <w:widowControl/>
-              <w:spacing w:before="0" w:after="40" w:line="240" w:lineRule="auto"/>
+            <w:tcMar>
+              <w:top w:w="40" w:type="dxa"/>
+              <w:bottom w:w="40" w:type="dxa"/>
+            </w:tcMar>
+          </w:tcPr>
+          <w:p>
+            <w:pPr>
+              <w:spacing w:before="0" w:after="0" w:line="260" w:lineRule="exact"/>
               <w:jc w:val="center"/>
-              <w:rPr>
-                <w:b/>
-              </w:rPr>
-            </w:pPr>
-            <w:r>
-              <w:rPr>
-                <w:rFonts w:eastAsia="Noto Sans CJK SC"/>
+            </w:pPr>
+            <w:r>
+              <w:rPr>
+                <w:rFonts w:ascii="Noto Sans CJK SC" w:hAnsi="Noto Sans CJK SC" w:eastAsia="Noto Sans CJK SC"/>
                 <w:b w:val="0"/>
-                <w:sz w:val="18"/>
+                <w:sz w:val="21"/>
               </w:rPr>
               <w:t>2026.10.19—10.25</w:t>
             </w:r>
@@ -471,43 +502,35 @@
           <w:tcPr>
             <w:tcW w:w="5032" w:type="dxa"/>
             <w:vAlign w:val="top"/>
-          </w:tcPr>
-          <w:p>
-            <w:pPr>
-              <w:keepNext/>
-              <w:widowControl/>
-              <w:spacing w:before="0" w:after="40" w:line="240" w:lineRule="auto"/>
-              <w:jc w:val="left"/>
-              <w:rPr>
-                <w:rFonts w:asciiTheme="minorEastAsia" w:hAnsiTheme="minorEastAsia"/>
-                <w:b/>
-                <w:sz w:val="18"/>
-                <w:szCs w:val="18"/>
-              </w:rPr>
-            </w:pPr>
-            <w:r>
-              <w:rPr>
-                <w:rFonts w:eastAsia="Noto Sans CJK SC"/>
-                <w:b/>
-                <w:sz w:val="20"/>
-              </w:rPr>
-              <w:t>上周工作情况（模拟）</w:t>
-            </w:r>
-          </w:p>
-          <w:p>
-            <w:pPr>
-              <w:keepNext w:val="0"/>
-              <w:widowControl/>
-              <w:spacing w:before="0" w:after="40" w:line="240" w:lineRule="auto"/>
-              <w:jc w:val="left"/>
-            </w:pPr>
-            <w:r>
-              <w:rPr>
-                <w:rFonts w:eastAsia="Noto Sans CJK SC"/>
+            <w:tcMar>
+              <w:top w:w="40" w:type="dxa"/>
+              <w:bottom w:w="40" w:type="dxa"/>
+            </w:tcMar>
+          </w:tcPr>
+          <w:p>
+            <w:pPr>
+              <w:spacing w:before="0" w:after="0" w:line="260" w:lineRule="exact"/>
+            </w:pPr>
+            <w:r>
+              <w:rPr>
+                <w:rFonts w:ascii="Noto Sans CJK SC" w:hAnsi="Noto Sans CJK SC" w:eastAsia="Noto Sans CJK SC"/>
+                <w:b/>
+                <w:sz w:val="21"/>
+              </w:rPr>
+              <w:t>上周工作情况</w:t>
+            </w:r>
+          </w:p>
+          <w:p>
+            <w:pPr>
+              <w:spacing w:before="0" w:after="0" w:line="260" w:lineRule="exact"/>
+            </w:pPr>
+            <w:r>
+              <w:rPr>
+                <w:rFonts w:ascii="Noto Sans CJK SC" w:hAnsi="Noto Sans CJK SC" w:eastAsia="Noto Sans CJK SC"/>
                 <w:b w:val="0"/>
-                <w:sz w:val="20"/>
-              </w:rPr>
-              <w:t>围绕“基于在线策略蒸馏的大语言模型后训练方法研究”，开展基础文献梳理、研究问题细化和预实验方案设计。重点对比学生生成轨迹上的教师监督、不同散度目标的适用性，以及稀疏反馈带来的信息损失与开销变化。形成文献对比笔记、三个研究问题的任务清单和小规模验证草案。以上为模拟安排，不表示该周已经实际完成。</w:t>
+                <w:sz w:val="21"/>
+              </w:rPr>
+              <w:t>梳理在线策略蒸馏相关文献，比较训练数据来源和散度目标的差异，细化开题报告中的研究问题及预实验方案。</w:t>
             </w:r>
           </w:p>
         </w:tc>
@@ -515,154 +538,22 @@
           <w:tcPr>
             <w:tcW w:w="5032" w:type="dxa"/>
             <w:vAlign w:val="top"/>
-          </w:tcPr>
-          <w:p>
-            <w:pPr>
-              <w:keepNext/>
-              <w:widowControl/>
-              <w:spacing w:before="0" w:after="40" w:line="240" w:lineRule="auto"/>
-              <w:jc w:val="left"/>
-              <w:rPr>
-                <w:b/>
-                <w:sz w:val="18"/>
-                <w:szCs w:val="18"/>
-              </w:rPr>
-            </w:pPr>
-            <w:r>
-              <w:rPr>
-                <w:rFonts w:eastAsia="Noto Sans CJK SC"/>
-                <w:b/>
-                <w:sz w:val="20"/>
-              </w:rPr>
-              <w:t>上周工作情况（模拟拟写）</w:t>
-            </w:r>
-          </w:p>
-          <w:p>
-            <w:pPr>
-              <w:keepNext/>
-              <w:widowControl/>
-              <w:spacing w:before="0" w:after="40" w:line="240" w:lineRule="auto"/>
-              <w:jc w:val="left"/>
-            </w:pPr>
-            <w:r>
-              <w:rPr>
-                <w:rFonts w:eastAsia="Noto Sans CJK SC"/>
-                <w:b/>
-                <w:sz w:val="20"/>
-              </w:rPr>
-              <w:t>1. 文献阅读与比较。</w:t>
-            </w:r>
-          </w:p>
-          <w:p>
-            <w:pPr>
-              <w:keepNext/>
-              <w:widowControl/>
-              <w:spacing w:before="0" w:after="40" w:line="240" w:lineRule="auto"/>
-              <w:jc w:val="left"/>
-            </w:pPr>
-            <w:r>
-              <w:rPr>
-                <w:rFonts w:eastAsia="Noto Sans CJK SC"/>
+            <w:tcMar>
+              <w:top w:w="40" w:type="dxa"/>
+              <w:bottom w:w="40" w:type="dxa"/>
+            </w:tcMar>
+          </w:tcPr>
+          <w:p>
+            <w:pPr>
+              <w:spacing w:before="0" w:after="0" w:line="260" w:lineRule="exact"/>
+            </w:pPr>
+            <w:r>
+              <w:rPr>
+                <w:rFonts w:ascii="Noto Sans CJK SC" w:hAnsi="Noto Sans CJK SC" w:eastAsia="Noto Sans CJK SC"/>
                 <w:b w:val="0"/>
-                <w:sz w:val="20"/>
-              </w:rPr>
-              <w:t>（1）Agarwal等，On-Policy Distillation of Language Models: Learning from Self-Generated Mistakes，ICLR 2024，arXiv:2306.13649，https://arxiv.org/abs/2306.13649。GKD让学生生成输出，再由教师在这些前缀上提供概率监督，并允许采用不同散度目标，旨在缓解训练数据分布与推理时学生生成分布不一致的问题。对本课题的帮助：明确“学生采样—教师反馈—损失计算—参数更新”的基本流程，并把轨迹来源与散度选择作为两个独立比较因素。</w:t>
-            </w:r>
-          </w:p>
-          <w:p>
-            <w:pPr>
-              <w:keepNext/>
-              <w:widowControl/>
-              <w:spacing w:before="0" w:after="40" w:line="240" w:lineRule="auto"/>
-              <w:jc w:val="left"/>
-            </w:pPr>
-            <w:r>
-              <w:rPr>
-                <w:rFonts w:eastAsia="Noto Sans CJK SC"/>
-                <w:b w:val="0"/>
-                <w:sz w:val="20"/>
-              </w:rPr>
-              <w:t>（2）Gu等，MiniLLM: Knowledge Distillation of Large Language Models，ICLR 2024，arXiv:2306.08543，https://arxiv.org/abs/2306.08543。该工作以反向KL替代传统正向KL，并设计相应的优化方法，减少学生对教师低概率区域的不合理拟合。对本课题的帮助：认识到正向与反向KL对分布匹配的侧重点不同；比较时应区分序列目标及其策略梯度估计与固定采样轨迹上的token损失，不能把同名反向KL直接视为相同训练算法。</w:t>
-            </w:r>
-          </w:p>
-          <w:p>
-            <w:pPr>
-              <w:keepNext/>
-              <w:widowControl/>
-              <w:spacing w:before="0" w:after="40" w:line="240" w:lineRule="auto"/>
-              <w:jc w:val="left"/>
-            </w:pPr>
-            <w:r>
-              <w:rPr>
-                <w:rFonts w:eastAsia="Noto Sans CJK SC"/>
-                <w:b w:val="0"/>
-                <w:sz w:val="20"/>
-              </w:rPr>
-              <w:t>（3）Ko等，DistiLLM: Towards Streamlined Distillation for Large Language Models，ICML 2024，PMLR 235:24872–24895，https://proceedings.mlr.press/v235/ko24c.html。该方法结合偏斜KL损失与自适应离策略策略，提高学生生成数据的利用效率，针对蒸馏目标选择与在线采样成本问题开展研究。对本课题的帮助：比较质量时同步记录生成、教师查询和更新耗时，并将样本复用造成的数据陈旧程度纳入分析。</w:t>
-            </w:r>
-          </w:p>
-          <w:p>
-            <w:pPr>
-              <w:keepNext/>
-              <w:widowControl/>
-              <w:spacing w:before="0" w:after="40" w:line="240" w:lineRule="auto"/>
-              <w:jc w:val="left"/>
-            </w:pPr>
-            <w:r>
-              <w:rPr>
-                <w:rFonts w:eastAsia="Noto Sans CJK SC"/>
-                <w:b w:val="0"/>
-                <w:sz w:val="20"/>
-              </w:rPr>
-              <w:t>2. 研究问题细化。将后续任务划分为决策状态与散度目标联合设计、决策感知稀疏反馈、统一测试系统三部分。状态指标先考虑教师熵、师生分歧和有效生成位置；这些指标仅是候选信号，不能直接等同于推理难度或决策重要性。</w:t>
-            </w:r>
-          </w:p>
-          <w:p>
-            <w:pPr>
-              <w:keepNext/>
-              <w:widowControl/>
-              <w:spacing w:before="0" w:after="40" w:line="240" w:lineRule="auto"/>
-              <w:jc w:val="left"/>
-            </w:pPr>
-            <w:r>
-              <w:rPr>
-                <w:rFonts w:eastAsia="Noto Sans CJK SC"/>
-                <w:b w:val="0"/>
-                <w:sz w:val="20"/>
-              </w:rPr>
-              <w:t>3. 预实验设计。先用可控概率分布检查完整词表、Top-K重新归一化和Top-K加残余类别三种反馈。固定K=8、32、128作为候选比较点，观察保留概率质量、损失偏差、梯度偏差和存储量；K值为拟定配置，不是实测设置。残余类别只汇总尾部总质量，不能保留尾部内部排序，也不能据此宣称恢复完整词表KL。</w:t>
-            </w:r>
-          </w:p>
-          <w:p>
-            <w:pPr>
-              <w:keepNext/>
-              <w:widowControl/>
-              <w:spacing w:before="0" w:after="40" w:line="240" w:lineRule="auto"/>
-              <w:jc w:val="left"/>
-            </w:pPr>
-            <w:r>
-              <w:rPr>
-                <w:rFonts w:eastAsia="Noto Sans CJK SC"/>
-                <w:b/>
-                <w:sz w:val="20"/>
-              </w:rPr>
-              <w:t>4. 实验结果。</w:t>
-            </w:r>
-          </w:p>
-          <w:p>
-            <w:pPr>
-              <w:keepNext w:val="0"/>
-              <w:widowControl/>
-              <w:spacing w:before="0" w:after="40" w:line="240" w:lineRule="auto"/>
-              <w:jc w:val="left"/>
-            </w:pPr>
-            <w:r>
-              <w:rPr>
-                <w:rFonts w:eastAsia="Noto Sans CJK SC"/>
-                <w:b w:val="0"/>
-                <w:sz w:val="20"/>
-              </w:rPr>
-              <w:t>尚无实测结果。本周报不填写准确率提升、耗时降低等数值；目前仅形成验证方案，具体结论待运行后补充。</w:t>
+                <w:sz w:val="21"/>
+              </w:rPr>
+              <w:t>重点梳理了两篇论文。GKD（Agarwal等，ICLR 2024，arXiv:2306.13649）在学生生成的序列上引入教师监督，缓解训练与推理阶段的数据分布差异，为本课题的在线采样流程提供了参考。MiniLLM（Gu等，ICLR 2024，arXiv:2306.08543）采用反向KL及相应优化方法，减少学生对教师低概率区域的不合理拟合，帮助明确了不同散度目标的比较思路。结合文献，将下一步重点放在Top-K反馈的信息损失分析及小规模验证上，模型训练尚未开展。</w:t>
             </w:r>
           </w:p>
         </w:tc>
@@ -670,25 +561,22 @@
           <w:tcPr>
             <w:tcW w:w="1701" w:type="dxa"/>
             <w:vAlign w:val="top"/>
-          </w:tcPr>
-          <w:p>
-            <w:pPr>
-              <w:keepNext w:val="0"/>
-              <w:widowControl/>
-              <w:spacing w:before="0" w:after="40" w:line="240" w:lineRule="auto"/>
-              <w:jc w:val="left"/>
-              <w:rPr>
-                <w:b/>
-                <w:szCs w:val="21"/>
-              </w:rPr>
-            </w:pPr>
-            <w:r>
-              <w:rPr>
-                <w:rFonts w:eastAsia="Noto Sans CJK SC"/>
+            <w:tcMar>
+              <w:top w:w="40" w:type="dxa"/>
+              <w:bottom w:w="40" w:type="dxa"/>
+            </w:tcMar>
+          </w:tcPr>
+          <w:p>
+            <w:pPr>
+              <w:spacing w:before="0" w:after="0" w:line="260" w:lineRule="exact"/>
+            </w:pPr>
+            <w:r>
+              <w:rPr>
+                <w:rFonts w:ascii="Noto Sans CJK SC" w:hAnsi="Noto Sans CJK SC" w:eastAsia="Noto Sans CJK SC"/>
                 <w:b w:val="0"/>
-                <w:sz w:val="20"/>
-              </w:rPr>
-              <w:t>模拟稿未核实实际完成时间；GPU训练、基线复现及Top-K验证均待执行。文献方法与项目实验结果分别表述。</w:t>
+                <w:sz w:val="21"/>
+              </w:rPr>
+              <w:t>近期同时准备另一篇论文，实验投入时间不足，训练与验证进度有所延后。</w:t>
             </w:r>
           </w:p>
         </w:tc>
@@ -714,22 +602,21 @@
           <w:tcPr>
             <w:tcW w:w="817" w:type="dxa"/>
             <w:vAlign w:val="top"/>
-          </w:tcPr>
-          <w:p>
-            <w:pPr>
-              <w:keepNext w:val="0"/>
-              <w:widowControl/>
-              <w:spacing w:before="0" w:after="40" w:line="240" w:lineRule="auto"/>
+            <w:tcMar>
+              <w:top w:w="40" w:type="dxa"/>
+              <w:bottom w:w="40" w:type="dxa"/>
+            </w:tcMar>
+          </w:tcPr>
+          <w:p>
+            <w:pPr>
+              <w:spacing w:before="0" w:after="0" w:line="260" w:lineRule="exact"/>
               <w:jc w:val="center"/>
-              <w:rPr>
-                <w:b/>
-              </w:rPr>
-            </w:pPr>
-            <w:r>
-              <w:rPr>
-                <w:rFonts w:eastAsia="Noto Sans CJK SC"/>
-                <w:b/>
-                <w:sz w:val="20"/>
+            </w:pPr>
+            <w:r>
+              <w:rPr>
+                <w:rFonts w:ascii="Noto Sans CJK SC" w:hAnsi="Noto Sans CJK SC" w:eastAsia="Noto Sans CJK SC"/>
+                <w:b/>
+                <w:sz w:val="21"/>
               </w:rPr>
               <w:t>本周</w:t>
             </w:r>
@@ -739,22 +626,21 @@
           <w:tcPr>
             <w:tcW w:w="1418" w:type="dxa"/>
             <w:vAlign w:val="top"/>
-          </w:tcPr>
-          <w:p>
-            <w:pPr>
-              <w:keepNext w:val="0"/>
-              <w:widowControl/>
-              <w:spacing w:before="0" w:after="40" w:line="240" w:lineRule="auto"/>
+            <w:tcMar>
+              <w:top w:w="40" w:type="dxa"/>
+              <w:bottom w:w="40" w:type="dxa"/>
+            </w:tcMar>
+          </w:tcPr>
+          <w:p>
+            <w:pPr>
+              <w:spacing w:before="0" w:after="0" w:line="260" w:lineRule="exact"/>
               <w:jc w:val="center"/>
-              <w:rPr>
-                <w:b/>
-              </w:rPr>
-            </w:pPr>
-            <w:r>
-              <w:rPr>
-                <w:rFonts w:eastAsia="Noto Sans CJK SC"/>
+            </w:pPr>
+            <w:r>
+              <w:rPr>
+                <w:rFonts w:ascii="Noto Sans CJK SC" w:hAnsi="Noto Sans CJK SC" w:eastAsia="Noto Sans CJK SC"/>
                 <w:b w:val="0"/>
-                <w:sz w:val="18"/>
+                <w:sz w:val="21"/>
               </w:rPr>
               <w:t>2026.10.26—11.01</w:t>
             </w:r>
@@ -764,138 +650,35 @@
           <w:tcPr>
             <w:tcW w:w="5032" w:type="dxa"/>
             <w:vAlign w:val="top"/>
-          </w:tcPr>
-          <w:p>
-            <w:pPr>
-              <w:keepNext/>
-              <w:widowControl/>
-              <w:spacing w:before="0" w:after="40" w:line="240" w:lineRule="auto"/>
-              <w:jc w:val="left"/>
-              <w:rPr>
-                <w:b/>
-                <w:sz w:val="18"/>
-                <w:szCs w:val="18"/>
-              </w:rPr>
-            </w:pPr>
-            <w:r>
-              <w:rPr>
-                <w:rFonts w:eastAsia="Noto Sans CJK SC"/>
-                <w:b/>
-                <w:sz w:val="20"/>
+            <w:tcMar>
+              <w:top w:w="40" w:type="dxa"/>
+              <w:bottom w:w="40" w:type="dxa"/>
+            </w:tcMar>
+          </w:tcPr>
+          <w:p>
+            <w:pPr>
+              <w:spacing w:before="0" w:after="0" w:line="260" w:lineRule="exact"/>
+            </w:pPr>
+            <w:r>
+              <w:rPr>
+                <w:rFonts w:ascii="Noto Sans CJK SC" w:hAnsi="Noto Sans CJK SC" w:eastAsia="Noto Sans CJK SC"/>
+                <w:b/>
+                <w:sz w:val="21"/>
               </w:rPr>
               <w:t>本周计划</w:t>
             </w:r>
           </w:p>
           <w:p>
             <w:pPr>
-              <w:keepNext/>
-              <w:widowControl/>
-              <w:spacing w:before="0" w:after="40" w:line="240" w:lineRule="auto"/>
-              <w:jc w:val="left"/>
-            </w:pPr>
-            <w:r>
-              <w:rPr>
-                <w:rFonts w:eastAsia="Noto Sans CJK SC"/>
+              <w:spacing w:before="0" w:after="0" w:line="260" w:lineRule="exact"/>
+            </w:pPr>
+            <w:r>
+              <w:rPr>
+                <w:rFonts w:ascii="Noto Sans CJK SC" w:hAnsi="Noto Sans CJK SC" w:eastAsia="Noto Sans CJK SC"/>
                 <w:b w:val="0"/>
-                <w:sz w:val="20"/>
-              </w:rPr>
-              <w:t>1. 周一：整理GKD、MiniLLM、DistiLLM的输入、目标函数、采样方式、教师接口和计算成本，形成统一对比表；逐项标记论文已有结论与本课题待验证假设，补充关键公式的适用条件。</w:t>
-            </w:r>
-          </w:p>
-          <w:p>
-            <w:pPr>
-              <w:keepNext/>
-              <w:widowControl/>
-              <w:spacing w:before="0" w:after="40" w:line="240" w:lineRule="auto"/>
-              <w:jc w:val="left"/>
-            </w:pPr>
-            <w:r>
-              <w:rPr>
-                <w:rFonts w:eastAsia="Noto Sans CJK SC"/>
-                <w:b w:val="0"/>
-                <w:sz w:val="20"/>
-              </w:rPr>
-              <w:t>2. 周二：设计概率反馈与蒸馏损失接口，明确输入张量形状[B,T,V]、有效token掩码[B,T]、温度、教师冻结和学生梯度路径；规定Top-K索引、原始概率、尾部总质量与无效位置的处理方式，避免将截断概率误当完整分布。</w:t>
-            </w:r>
-          </w:p>
-          <w:p>
-            <w:pPr>
-              <w:keepNext/>
-              <w:widowControl/>
-              <w:spacing w:before="0" w:after="40" w:line="240" w:lineRule="auto"/>
-              <w:jc w:val="left"/>
-            </w:pPr>
-            <w:r>
-              <w:rPr>
-                <w:rFonts w:eastAsia="Noto Sans CJK SC"/>
-                <w:b w:val="0"/>
-                <w:sz w:val="20"/>
-              </w:rPr>
-              <w:t>3. 周三：实现可控分布的小规模验证，覆盖均匀、尖峰和长尾分布；比较完整分布、Top-K重新归一化及残余类别方案。检查K=V时的一致性、K=1边界、极小概率、概率和、NaN/Inf及梯度传播；若未通过，不进入模型级比较。</w:t>
-            </w:r>
-          </w:p>
-          <w:p>
-            <w:pPr>
-              <w:keepNext/>
-              <w:widowControl/>
-              <w:spacing w:before="0" w:after="40" w:line="240" w:lineRule="auto"/>
-              <w:jc w:val="left"/>
-            </w:pPr>
-            <w:r>
-              <w:rPr>
-                <w:rFonts w:eastAsia="Noto Sans CJK SC"/>
-                <w:b w:val="0"/>
-                <w:sz w:val="20"/>
-              </w:rPr>
-              <w:t>4. 周四：根据可用显存确认同系列教师与学生模型，Qwen3-0.6B与Qwen3-4B仅作候选，实际版本和配置另行记录。选取固定小样本与独立评估集合，打通学生生成、教师反馈、损失计算、一次更新和指标保存的最小闭环。</w:t>
-            </w:r>
-          </w:p>
-          <w:p>
-            <w:pPr>
-              <w:keepNext/>
-              <w:widowControl/>
-              <w:spacing w:before="0" w:after="40" w:line="240" w:lineRule="auto"/>
-              <w:jc w:val="left"/>
-            </w:pPr>
-            <w:r>
-              <w:rPr>
-                <w:rFonts w:eastAsia="Noto Sans CJK SC"/>
-                <w:b w:val="0"/>
-                <w:sz w:val="20"/>
-              </w:rPr>
-              <w:t>5. 周五：在同一学生、数据、优化器、学习率、有效token预算和生成配置下，比较固定正向KL、固定反向KL及候选加权目标。先完成可运行性检查，再决定是否开展正式对照；不得预设加权方案优于固定目标。</w:t>
-            </w:r>
-          </w:p>
-          <w:p>
-            <w:pPr>
-              <w:keepNext/>
-              <w:widowControl/>
-              <w:spacing w:before="0" w:after="40" w:line="240" w:lineRule="auto"/>
-              <w:jc w:val="left"/>
-            </w:pPr>
-            <w:r>
-              <w:rPr>
-                <w:rFonts w:eastAsia="Noto Sans CJK SC"/>
-                <w:b w:val="0"/>
-                <w:sz w:val="20"/>
-              </w:rPr>
-              <w:t>6. 周末：整理训练损失、任务指标、教师查询量、反馈数据量、峰值显存以及生成/教师前向/学生更新分项耗时。对异常样例保留原始输出与配置，形成问题清单和下一轮消融方案。</w:t>
-            </w:r>
-          </w:p>
-          <w:p>
-            <w:pPr>
-              <w:keepNext w:val="0"/>
-              <w:widowControl/>
-              <w:spacing w:before="0" w:after="40" w:line="240" w:lineRule="auto"/>
-              <w:jc w:val="left"/>
-            </w:pPr>
-            <w:r>
-              <w:rPr>
-                <w:rFonts w:eastAsia="Noto Sans CJK SC"/>
-                <w:b w:val="0"/>
-                <w:sz w:val="20"/>
-              </w:rPr>
-              <w:t>7. 预期交付：文献对比表、接口草案、概率分布验证脚本与结果文件、最小闭环运行记录、后续对照配置。正式结果记录Git提交、随机种子、模型版本、依赖及硬件环境；尚未完成的项目明确写“待实验验证”。</w:t>
+                <w:sz w:val="21"/>
+              </w:rPr>
+              <w:t>先用可控概率分布比较完整词表、Top-K重新归一化和尾部质量汇总三种反馈方式，检查损失及梯度差异；再根据结果确定教师反馈接口，尝试打通学生生成、教师反馈和一次参数更新的最小训练流程。整理配置与运行记录，为后续基线对照做准备。</w:t>
             </w:r>
           </w:p>
         </w:tc>
@@ -903,26 +686,21 @@
           <w:tcPr>
             <w:tcW w:w="5032" w:type="dxa"/>
             <w:vAlign w:val="top"/>
-          </w:tcPr>
-          <w:p>
-            <w:pPr>
-              <w:keepNext w:val="0"/>
-              <w:widowControl/>
-              <w:spacing w:before="0" w:after="40" w:line="240" w:lineRule="auto"/>
-              <w:jc w:val="left"/>
-              <w:rPr>
-                <w:b/>
-                <w:sz w:val="18"/>
-                <w:szCs w:val="18"/>
-              </w:rPr>
-            </w:pPr>
-            <w:r>
-              <w:rPr>
-                <w:rFonts w:eastAsia="Noto Sans CJK SC"/>
+            <w:tcMar>
+              <w:top w:w="40" w:type="dxa"/>
+              <w:bottom w:w="40" w:type="dxa"/>
+            </w:tcMar>
+          </w:tcPr>
+          <w:p>
+            <w:pPr>
+              <w:spacing w:before="0" w:after="0" w:line="260" w:lineRule="exact"/>
+            </w:pPr>
+            <w:r>
+              <w:rPr>
+                <w:rFonts w:ascii="Noto Sans CJK SC" w:hAnsi="Noto Sans CJK SC" w:eastAsia="Noto Sans CJK SC"/>
                 <w:b w:val="0"/>
-                <w:sz w:val="20"/>
-              </w:rPr>
-              <w:t>计划执行，尚未开始或完成状态待实际记录。验收依据：脚本能够复跑；关键数值与梯度检查通过；配置与原始结果可追溯；方法质量和资源开销分别报告。若算力不足，优先完成可控分布验证及接口测试，不以模拟数据替代真实训练结果。</w:t>
+                <w:sz w:val="21"/>
+              </w:rPr>
             </w:r>
           </w:p>
         </w:tc>
@@ -930,24 +708,21 @@
           <w:tcPr>
             <w:tcW w:w="1701" w:type="dxa"/>
             <w:vAlign w:val="top"/>
-          </w:tcPr>
-          <w:p>
-            <w:pPr>
-              <w:keepNext w:val="0"/>
-              <w:widowControl/>
-              <w:spacing w:before="0" w:after="40" w:line="240" w:lineRule="auto"/>
-              <w:jc w:val="left"/>
-              <w:rPr>
-                <w:szCs w:val="21"/>
-              </w:rPr>
-            </w:pPr>
-            <w:r>
-              <w:rPr>
-                <w:rFonts w:eastAsia="Noto Sans CJK SC"/>
+            <w:tcMar>
+              <w:top w:w="40" w:type="dxa"/>
+              <w:bottom w:w="40" w:type="dxa"/>
+            </w:tcMar>
+          </w:tcPr>
+          <w:p>
+            <w:pPr>
+              <w:spacing w:before="0" w:after="0" w:line="260" w:lineRule="exact"/>
+            </w:pPr>
+            <w:r>
+              <w:rPr>
+                <w:rFonts w:ascii="Noto Sans CJK SC" w:hAnsi="Noto Sans CJK SC" w:eastAsia="Noto Sans CJK SC"/>
                 <w:b w:val="0"/>
-                <w:sz w:val="20"/>
-              </w:rPr>
-              <w:t>可能限制：算力与模型下载、教师反馈开销、不同反馈方案的公平预算。出现阻塞时记录具体原因，并调整本周工作量。</w:t>
+                <w:sz w:val="21"/>
+              </w:rPr>
             </w:r>
           </w:p>
         </w:tc>
@@ -969,12 +744,20 @@
             <w:right w:w="108" w:type="dxa"/>
           </w:tblCellMar>
         </w:tblPrEx>
+        <w:trPr>
+          <w:trHeight w:val="288" w:hRule="exact"/>
+        </w:trPr>
         <w:tc>
           <w:tcPr>
             <w:tcW w:w="817" w:type="dxa"/>
-          </w:tcPr>
-          <w:p>
-            <w:pPr>
+            <w:tcMar>
+              <w:top w:w="40" w:type="dxa"/>
+              <w:bottom w:w="40" w:type="dxa"/>
+            </w:tcMar>
+          </w:tcPr>
+          <w:p>
+            <w:pPr>
+              <w:spacing w:before="0" w:after="0" w:line="260" w:lineRule="exact"/>
               <w:jc w:val="center"/>
               <w:rPr>
                 <w:b/>
@@ -982,8 +765,9 @@
             </w:pPr>
             <w:r>
               <w:rPr>
-                <w:rFonts w:hint="eastAsia" w:eastAsia="Noto Sans CJK SC"/>
-                <w:b/>
+                <w:rFonts w:hint="eastAsia" w:eastAsia="Noto Sans CJK SC" w:ascii="Noto Sans CJK SC" w:hAnsi="Noto Sans CJK SC"/>
+                <w:b/>
+                <w:sz w:val="21"/>
               </w:rPr>
               <w:t>3</w:t>
             </w:r>
@@ -992,9 +776,14 @@
         <w:tc>
           <w:tcPr>
             <w:tcW w:w="1418" w:type="dxa"/>
-          </w:tcPr>
-          <w:p>
-            <w:pPr>
+            <w:tcMar>
+              <w:top w:w="40" w:type="dxa"/>
+              <w:bottom w:w="40" w:type="dxa"/>
+            </w:tcMar>
+          </w:tcPr>
+          <w:p>
+            <w:pPr>
+              <w:spacing w:before="0" w:after="0" w:line="260" w:lineRule="exact"/>
               <w:jc w:val="center"/>
               <w:rPr>
                 <w:b/>
@@ -1005,9 +794,14 @@
         <w:tc>
           <w:tcPr>
             <w:tcW w:w="5032" w:type="dxa"/>
-          </w:tcPr>
-          <w:p>
-            <w:pPr>
+            <w:tcMar>
+              <w:top w:w="40" w:type="dxa"/>
+              <w:bottom w:w="40" w:type="dxa"/>
+            </w:tcMar>
+          </w:tcPr>
+          <w:p>
+            <w:pPr>
+              <w:spacing w:before="0" w:after="0" w:line="260" w:lineRule="exact"/>
               <w:jc w:val="left"/>
               <w:rPr>
                 <w:b/>
@@ -1020,9 +814,14 @@
         <w:tc>
           <w:tcPr>
             <w:tcW w:w="5032" w:type="dxa"/>
-          </w:tcPr>
-          <w:p>
-            <w:pPr>
+            <w:tcMar>
+              <w:top w:w="40" w:type="dxa"/>
+              <w:bottom w:w="40" w:type="dxa"/>
+            </w:tcMar>
+          </w:tcPr>
+          <w:p>
+            <w:pPr>
+              <w:spacing w:before="0" w:after="0" w:line="260" w:lineRule="exact"/>
               <w:jc w:val="left"/>
               <w:rPr>
                 <w:b/>
@@ -1035,9 +834,14 @@
         <w:tc>
           <w:tcPr>
             <w:tcW w:w="1701" w:type="dxa"/>
-          </w:tcPr>
-          <w:p>
-            <w:pPr>
+            <w:tcMar>
+              <w:top w:w="40" w:type="dxa"/>
+              <w:bottom w:w="40" w:type="dxa"/>
+            </w:tcMar>
+          </w:tcPr>
+          <w:p>
+            <w:pPr>
+              <w:spacing w:before="0" w:after="0" w:line="260" w:lineRule="exact"/>
               <w:jc w:val="left"/>
               <w:rPr>
                 <w:b/>
@@ -1064,12 +868,20 @@
             <w:right w:w="108" w:type="dxa"/>
           </w:tblCellMar>
         </w:tblPrEx>
+        <w:trPr>
+          <w:trHeight w:val="288" w:hRule="exact"/>
+        </w:trPr>
         <w:tc>
           <w:tcPr>
             <w:tcW w:w="817" w:type="dxa"/>
-          </w:tcPr>
-          <w:p>
-            <w:pPr>
+            <w:tcMar>
+              <w:top w:w="40" w:type="dxa"/>
+              <w:bottom w:w="40" w:type="dxa"/>
+            </w:tcMar>
+          </w:tcPr>
+          <w:p>
+            <w:pPr>
+              <w:spacing w:before="0" w:after="0" w:line="260" w:lineRule="exact"/>
               <w:jc w:val="center"/>
               <w:rPr>
                 <w:b/>
@@ -1077,8 +889,9 @@
             </w:pPr>
             <w:r>
               <w:rPr>
-                <w:rFonts w:hint="eastAsia" w:eastAsia="Noto Sans CJK SC"/>
-                <w:b/>
+                <w:rFonts w:hint="eastAsia" w:eastAsia="Noto Sans CJK SC" w:ascii="Noto Sans CJK SC" w:hAnsi="Noto Sans CJK SC"/>
+                <w:b/>
+                <w:sz w:val="21"/>
               </w:rPr>
               <w:t>4</w:t>
             </w:r>
@@ -1087,9 +900,14 @@
         <w:tc>
           <w:tcPr>
             <w:tcW w:w="1418" w:type="dxa"/>
-          </w:tcPr>
-          <w:p>
-            <w:pPr>
+            <w:tcMar>
+              <w:top w:w="40" w:type="dxa"/>
+              <w:bottom w:w="40" w:type="dxa"/>
+            </w:tcMar>
+          </w:tcPr>
+          <w:p>
+            <w:pPr>
+              <w:spacing w:before="0" w:after="0" w:line="260" w:lineRule="exact"/>
               <w:jc w:val="center"/>
               <w:rPr>
                 <w:b/>
@@ -1100,9 +918,14 @@
         <w:tc>
           <w:tcPr>
             <w:tcW w:w="5032" w:type="dxa"/>
-          </w:tcPr>
-          <w:p>
-            <w:pPr>
+            <w:tcMar>
+              <w:top w:w="40" w:type="dxa"/>
+              <w:bottom w:w="40" w:type="dxa"/>
+            </w:tcMar>
+          </w:tcPr>
+          <w:p>
+            <w:pPr>
+              <w:spacing w:before="0" w:after="0" w:line="260" w:lineRule="exact"/>
               <w:jc w:val="left"/>
               <w:rPr>
                 <w:b/>
@@ -1115,9 +938,14 @@
         <w:tc>
           <w:tcPr>
             <w:tcW w:w="5032" w:type="dxa"/>
-          </w:tcPr>
-          <w:p>
-            <w:pPr>
+            <w:tcMar>
+              <w:top w:w="40" w:type="dxa"/>
+              <w:bottom w:w="40" w:type="dxa"/>
+            </w:tcMar>
+          </w:tcPr>
+          <w:p>
+            <w:pPr>
+              <w:spacing w:before="0" w:after="0" w:line="260" w:lineRule="exact"/>
               <w:jc w:val="left"/>
               <w:rPr>
                 <w:b/>
@@ -1130,9 +958,14 @@
         <w:tc>
           <w:tcPr>
             <w:tcW w:w="1701" w:type="dxa"/>
-          </w:tcPr>
-          <w:p>
-            <w:pPr>
+            <w:tcMar>
+              <w:top w:w="40" w:type="dxa"/>
+              <w:bottom w:w="40" w:type="dxa"/>
+            </w:tcMar>
+          </w:tcPr>
+          <w:p>
+            <w:pPr>
+              <w:spacing w:before="0" w:after="0" w:line="260" w:lineRule="exact"/>
               <w:jc w:val="left"/>
               <w:rPr>
                 <w:b/>
@@ -1159,12 +992,20 @@
             <w:right w:w="108" w:type="dxa"/>
           </w:tblCellMar>
         </w:tblPrEx>
+        <w:trPr>
+          <w:trHeight w:val="288" w:hRule="exact"/>
+        </w:trPr>
         <w:tc>
           <w:tcPr>
             <w:tcW w:w="817" w:type="dxa"/>
-          </w:tcPr>
-          <w:p>
-            <w:pPr>
+            <w:tcMar>
+              <w:top w:w="40" w:type="dxa"/>
+              <w:bottom w:w="40" w:type="dxa"/>
+            </w:tcMar>
+          </w:tcPr>
+          <w:p>
+            <w:pPr>
+              <w:spacing w:before="0" w:after="0" w:line="260" w:lineRule="exact"/>
               <w:jc w:val="center"/>
               <w:rPr>
                 <w:b/>
@@ -1172,8 +1013,9 @@
             </w:pPr>
             <w:r>
               <w:rPr>
-                <w:rFonts w:hint="eastAsia" w:eastAsia="Noto Sans CJK SC"/>
-                <w:b/>
+                <w:rFonts w:hint="eastAsia" w:eastAsia="Noto Sans CJK SC" w:ascii="Noto Sans CJK SC" w:hAnsi="Noto Sans CJK SC"/>
+                <w:b/>
+                <w:sz w:val="21"/>
               </w:rPr>
               <w:t>5</w:t>
             </w:r>
@@ -1182,9 +1024,14 @@
         <w:tc>
           <w:tcPr>
             <w:tcW w:w="1418" w:type="dxa"/>
-          </w:tcPr>
-          <w:p>
-            <w:pPr>
+            <w:tcMar>
+              <w:top w:w="40" w:type="dxa"/>
+              <w:bottom w:w="40" w:type="dxa"/>
+            </w:tcMar>
+          </w:tcPr>
+          <w:p>
+            <w:pPr>
+              <w:spacing w:before="0" w:after="0" w:line="260" w:lineRule="exact"/>
               <w:jc w:val="center"/>
               <w:rPr>
                 <w:b/>
@@ -1195,9 +1042,14 @@
         <w:tc>
           <w:tcPr>
             <w:tcW w:w="5032" w:type="dxa"/>
-          </w:tcPr>
-          <w:p>
-            <w:pPr>
+            <w:tcMar>
+              <w:top w:w="40" w:type="dxa"/>
+              <w:bottom w:w="40" w:type="dxa"/>
+            </w:tcMar>
+          </w:tcPr>
+          <w:p>
+            <w:pPr>
+              <w:spacing w:before="0" w:after="0" w:line="260" w:lineRule="exact"/>
               <w:jc w:val="left"/>
               <w:rPr>
                 <w:b/>
@@ -1210,9 +1062,14 @@
         <w:tc>
           <w:tcPr>
             <w:tcW w:w="5032" w:type="dxa"/>
-          </w:tcPr>
-          <w:p>
-            <w:pPr>
+            <w:tcMar>
+              <w:top w:w="40" w:type="dxa"/>
+              <w:bottom w:w="40" w:type="dxa"/>
+            </w:tcMar>
+          </w:tcPr>
+          <w:p>
+            <w:pPr>
+              <w:spacing w:before="0" w:after="0" w:line="260" w:lineRule="exact"/>
               <w:jc w:val="left"/>
               <w:rPr>
                 <w:b/>
@@ -1225,9 +1082,14 @@
         <w:tc>
           <w:tcPr>
             <w:tcW w:w="1701" w:type="dxa"/>
-          </w:tcPr>
-          <w:p>
-            <w:pPr>
+            <w:tcMar>
+              <w:top w:w="40" w:type="dxa"/>
+              <w:bottom w:w="40" w:type="dxa"/>
+            </w:tcMar>
+          </w:tcPr>
+          <w:p>
+            <w:pPr>
+              <w:spacing w:before="0" w:after="0" w:line="260" w:lineRule="exact"/>
               <w:jc w:val="left"/>
               <w:rPr>
                 <w:b/>
@@ -1254,12 +1116,20 @@
             <w:right w:w="108" w:type="dxa"/>
           </w:tblCellMar>
         </w:tblPrEx>
+        <w:trPr>
+          <w:trHeight w:val="288" w:hRule="exact"/>
+        </w:trPr>
         <w:tc>
           <w:tcPr>
             <w:tcW w:w="817" w:type="dxa"/>
-          </w:tcPr>
-          <w:p>
-            <w:pPr>
+            <w:tcMar>
+              <w:top w:w="40" w:type="dxa"/>
+              <w:bottom w:w="40" w:type="dxa"/>
+            </w:tcMar>
+          </w:tcPr>
+          <w:p>
+            <w:pPr>
+              <w:spacing w:before="0" w:after="0" w:line="260" w:lineRule="exact"/>
               <w:jc w:val="center"/>
               <w:rPr>
                 <w:b/>
@@ -1267,8 +1137,9 @@
             </w:pPr>
             <w:r>
               <w:rPr>
-                <w:rFonts w:hint="eastAsia" w:eastAsia="Noto Sans CJK SC"/>
-                <w:b/>
+                <w:rFonts w:hint="eastAsia" w:eastAsia="Noto Sans CJK SC" w:ascii="Noto Sans CJK SC" w:hAnsi="Noto Sans CJK SC"/>
+                <w:b/>
+                <w:sz w:val="21"/>
               </w:rPr>
               <w:t>6</w:t>
             </w:r>
@@ -1277,9 +1148,14 @@
         <w:tc>
           <w:tcPr>
             <w:tcW w:w="1418" w:type="dxa"/>
-          </w:tcPr>
-          <w:p>
-            <w:pPr>
+            <w:tcMar>
+              <w:top w:w="40" w:type="dxa"/>
+              <w:bottom w:w="40" w:type="dxa"/>
+            </w:tcMar>
+          </w:tcPr>
+          <w:p>
+            <w:pPr>
+              <w:spacing w:before="0" w:after="0" w:line="260" w:lineRule="exact"/>
               <w:jc w:val="center"/>
               <w:rPr>
                 <w:b/>
@@ -1290,9 +1166,14 @@
         <w:tc>
           <w:tcPr>
             <w:tcW w:w="5032" w:type="dxa"/>
-          </w:tcPr>
-          <w:p>
-            <w:pPr>
+            <w:tcMar>
+              <w:top w:w="40" w:type="dxa"/>
+              <w:bottom w:w="40" w:type="dxa"/>
+            </w:tcMar>
+          </w:tcPr>
+          <w:p>
+            <w:pPr>
+              <w:spacing w:before="0" w:after="0" w:line="260" w:lineRule="exact"/>
               <w:jc w:val="left"/>
               <w:rPr>
                 <w:b/>
@@ -1305,9 +1186,14 @@
         <w:tc>
           <w:tcPr>
             <w:tcW w:w="5032" w:type="dxa"/>
-          </w:tcPr>
-          <w:p>
-            <w:pPr>
+            <w:tcMar>
+              <w:top w:w="40" w:type="dxa"/>
+              <w:bottom w:w="40" w:type="dxa"/>
+            </w:tcMar>
+          </w:tcPr>
+          <w:p>
+            <w:pPr>
+              <w:spacing w:before="0" w:after="0" w:line="260" w:lineRule="exact"/>
               <w:jc w:val="left"/>
               <w:rPr>
                 <w:b/>
@@ -1320,9 +1206,14 @@
         <w:tc>
           <w:tcPr>
             <w:tcW w:w="1701" w:type="dxa"/>
-          </w:tcPr>
-          <w:p>
-            <w:pPr>
+            <w:tcMar>
+              <w:top w:w="40" w:type="dxa"/>
+              <w:bottom w:w="40" w:type="dxa"/>
+            </w:tcMar>
+          </w:tcPr>
+          <w:p>
+            <w:pPr>
+              <w:spacing w:before="0" w:after="0" w:line="260" w:lineRule="exact"/>
               <w:jc w:val="left"/>
               <w:rPr>
                 <w:b/>
@@ -1349,12 +1240,20 @@
             <w:right w:w="108" w:type="dxa"/>
           </w:tblCellMar>
         </w:tblPrEx>
+        <w:trPr>
+          <w:trHeight w:val="288" w:hRule="exact"/>
+        </w:trPr>
         <w:tc>
           <w:tcPr>
             <w:tcW w:w="817" w:type="dxa"/>
-          </w:tcPr>
-          <w:p>
-            <w:pPr>
+            <w:tcMar>
+              <w:top w:w="40" w:type="dxa"/>
+              <w:bottom w:w="40" w:type="dxa"/>
+            </w:tcMar>
+          </w:tcPr>
+          <w:p>
+            <w:pPr>
+              <w:spacing w:before="0" w:after="0" w:line="260" w:lineRule="exact"/>
               <w:jc w:val="center"/>
               <w:rPr>
                 <w:b/>
@@ -1362,8 +1261,9 @@
             </w:pPr>
             <w:r>
               <w:rPr>
-                <w:rFonts w:hint="eastAsia" w:eastAsia="Noto Sans CJK SC"/>
-                <w:b/>
+                <w:rFonts w:hint="eastAsia" w:eastAsia="Noto Sans CJK SC" w:ascii="Noto Sans CJK SC" w:hAnsi="Noto Sans CJK SC"/>
+                <w:b/>
+                <w:sz w:val="21"/>
               </w:rPr>
               <w:t>7</w:t>
             </w:r>
@@ -1372,9 +1272,14 @@
         <w:tc>
           <w:tcPr>
             <w:tcW w:w="1418" w:type="dxa"/>
-          </w:tcPr>
-          <w:p>
-            <w:pPr>
+            <w:tcMar>
+              <w:top w:w="40" w:type="dxa"/>
+              <w:bottom w:w="40" w:type="dxa"/>
+            </w:tcMar>
+          </w:tcPr>
+          <w:p>
+            <w:pPr>
+              <w:spacing w:before="0" w:after="0" w:line="260" w:lineRule="exact"/>
               <w:jc w:val="center"/>
               <w:rPr>
                 <w:b/>
@@ -1385,9 +1290,14 @@
         <w:tc>
           <w:tcPr>
             <w:tcW w:w="5032" w:type="dxa"/>
-          </w:tcPr>
-          <w:p>
-            <w:pPr>
+            <w:tcMar>
+              <w:top w:w="40" w:type="dxa"/>
+              <w:bottom w:w="40" w:type="dxa"/>
+            </w:tcMar>
+          </w:tcPr>
+          <w:p>
+            <w:pPr>
+              <w:spacing w:before="0" w:after="0" w:line="260" w:lineRule="exact"/>
               <w:jc w:val="left"/>
               <w:rPr>
                 <w:b/>
@@ -1400,9 +1310,14 @@
         <w:tc>
           <w:tcPr>
             <w:tcW w:w="5032" w:type="dxa"/>
-          </w:tcPr>
-          <w:p>
-            <w:pPr>
+            <w:tcMar>
+              <w:top w:w="40" w:type="dxa"/>
+              <w:bottom w:w="40" w:type="dxa"/>
+            </w:tcMar>
+          </w:tcPr>
+          <w:p>
+            <w:pPr>
+              <w:spacing w:before="0" w:after="0" w:line="260" w:lineRule="exact"/>
               <w:jc w:val="left"/>
               <w:rPr>
                 <w:b/>
@@ -1415,9 +1330,14 @@
         <w:tc>
           <w:tcPr>
             <w:tcW w:w="1701" w:type="dxa"/>
-          </w:tcPr>
-          <w:p>
-            <w:pPr>
+            <w:tcMar>
+              <w:top w:w="40" w:type="dxa"/>
+              <w:bottom w:w="40" w:type="dxa"/>
+            </w:tcMar>
+          </w:tcPr>
+          <w:p>
+            <w:pPr>
+              <w:spacing w:before="0" w:after="0" w:line="260" w:lineRule="exact"/>
               <w:jc w:val="left"/>
               <w:rPr>
                 <w:b/>
@@ -1444,12 +1364,20 @@
             <w:right w:w="108" w:type="dxa"/>
           </w:tblCellMar>
         </w:tblPrEx>
+        <w:trPr>
+          <w:trHeight w:val="288" w:hRule="exact"/>
+        </w:trPr>
         <w:tc>
           <w:tcPr>
             <w:tcW w:w="817" w:type="dxa"/>
-          </w:tcPr>
-          <w:p>
-            <w:pPr>
+            <w:tcMar>
+              <w:top w:w="40" w:type="dxa"/>
+              <w:bottom w:w="40" w:type="dxa"/>
+            </w:tcMar>
+          </w:tcPr>
+          <w:p>
+            <w:pPr>
+              <w:spacing w:before="0" w:after="0" w:line="260" w:lineRule="exact"/>
               <w:jc w:val="center"/>
               <w:rPr>
                 <w:b/>
@@ -1457,8 +1385,9 @@
             </w:pPr>
             <w:r>
               <w:rPr>
-                <w:rFonts w:hint="eastAsia" w:eastAsia="Noto Sans CJK SC"/>
-                <w:b/>
+                <w:rFonts w:hint="eastAsia" w:eastAsia="Noto Sans CJK SC" w:ascii="Noto Sans CJK SC" w:hAnsi="Noto Sans CJK SC"/>
+                <w:b/>
+                <w:sz w:val="21"/>
               </w:rPr>
               <w:t>8</w:t>
             </w:r>
@@ -1467,9 +1396,14 @@
         <w:tc>
           <w:tcPr>
             <w:tcW w:w="1418" w:type="dxa"/>
-          </w:tcPr>
-          <w:p>
-            <w:pPr>
+            <w:tcMar>
+              <w:top w:w="40" w:type="dxa"/>
+              <w:bottom w:w="40" w:type="dxa"/>
+            </w:tcMar>
+          </w:tcPr>
+          <w:p>
+            <w:pPr>
+              <w:spacing w:before="0" w:after="0" w:line="260" w:lineRule="exact"/>
               <w:jc w:val="center"/>
               <w:rPr>
                 <w:b/>
@@ -1480,9 +1414,14 @@
         <w:tc>
           <w:tcPr>
             <w:tcW w:w="5032" w:type="dxa"/>
-          </w:tcPr>
-          <w:p>
-            <w:pPr>
+            <w:tcMar>
+              <w:top w:w="40" w:type="dxa"/>
+              <w:bottom w:w="40" w:type="dxa"/>
+            </w:tcMar>
+          </w:tcPr>
+          <w:p>
+            <w:pPr>
+              <w:spacing w:before="0" w:after="0" w:line="260" w:lineRule="exact"/>
               <w:jc w:val="left"/>
               <w:rPr>
                 <w:b/>
@@ -1495,9 +1434,14 @@
         <w:tc>
           <w:tcPr>
             <w:tcW w:w="5032" w:type="dxa"/>
-          </w:tcPr>
-          <w:p>
-            <w:pPr>
+            <w:tcMar>
+              <w:top w:w="40" w:type="dxa"/>
+              <w:bottom w:w="40" w:type="dxa"/>
+            </w:tcMar>
+          </w:tcPr>
+          <w:p>
+            <w:pPr>
+              <w:spacing w:before="0" w:after="0" w:line="260" w:lineRule="exact"/>
               <w:jc w:val="left"/>
               <w:rPr>
                 <w:b/>
@@ -1510,9 +1454,14 @@
         <w:tc>
           <w:tcPr>
             <w:tcW w:w="1701" w:type="dxa"/>
-          </w:tcPr>
-          <w:p>
-            <w:pPr>
+            <w:tcMar>
+              <w:top w:w="40" w:type="dxa"/>
+              <w:bottom w:w="40" w:type="dxa"/>
+            </w:tcMar>
+          </w:tcPr>
+          <w:p>
+            <w:pPr>
+              <w:spacing w:before="0" w:after="0" w:line="260" w:lineRule="exact"/>
               <w:jc w:val="left"/>
               <w:rPr>
                 <w:b/>
@@ -1539,12 +1488,20 @@
             <w:right w:w="108" w:type="dxa"/>
           </w:tblCellMar>
         </w:tblPrEx>
+        <w:trPr>
+          <w:trHeight w:val="288" w:hRule="exact"/>
+        </w:trPr>
         <w:tc>
           <w:tcPr>
             <w:tcW w:w="817" w:type="dxa"/>
-          </w:tcPr>
-          <w:p>
-            <w:pPr>
+            <w:tcMar>
+              <w:top w:w="40" w:type="dxa"/>
+              <w:bottom w:w="40" w:type="dxa"/>
+            </w:tcMar>
+          </w:tcPr>
+          <w:p>
+            <w:pPr>
+              <w:spacing w:before="0" w:after="0" w:line="260" w:lineRule="exact"/>
               <w:jc w:val="center"/>
               <w:rPr>
                 <w:b/>
@@ -1552,8 +1509,9 @@
             </w:pPr>
             <w:r>
               <w:rPr>
-                <w:rFonts w:hint="eastAsia" w:eastAsia="Noto Sans CJK SC"/>
-                <w:b/>
+                <w:rFonts w:hint="eastAsia" w:eastAsia="Noto Sans CJK SC" w:ascii="Noto Sans CJK SC" w:hAnsi="Noto Sans CJK SC"/>
+                <w:b/>
+                <w:sz w:val="21"/>
               </w:rPr>
               <w:t>9</w:t>
             </w:r>
@@ -1562,9 +1520,14 @@
         <w:tc>
           <w:tcPr>
             <w:tcW w:w="1418" w:type="dxa"/>
-          </w:tcPr>
-          <w:p>
-            <w:pPr>
+            <w:tcMar>
+              <w:top w:w="40" w:type="dxa"/>
+              <w:bottom w:w="40" w:type="dxa"/>
+            </w:tcMar>
+          </w:tcPr>
+          <w:p>
+            <w:pPr>
+              <w:spacing w:before="0" w:after="0" w:line="260" w:lineRule="exact"/>
               <w:jc w:val="center"/>
               <w:rPr>
                 <w:b/>
@@ -1575,9 +1538,14 @@
         <w:tc>
           <w:tcPr>
             <w:tcW w:w="5032" w:type="dxa"/>
-          </w:tcPr>
-          <w:p>
-            <w:pPr>
+            <w:tcMar>
+              <w:top w:w="40" w:type="dxa"/>
+              <w:bottom w:w="40" w:type="dxa"/>
+            </w:tcMar>
+          </w:tcPr>
+          <w:p>
+            <w:pPr>
+              <w:spacing w:before="0" w:after="0" w:line="260" w:lineRule="exact"/>
               <w:jc w:val="left"/>
               <w:rPr>
                 <w:b/>
@@ -1590,9 +1558,14 @@
         <w:tc>
           <w:tcPr>
             <w:tcW w:w="5032" w:type="dxa"/>
-          </w:tcPr>
-          <w:p>
-            <w:pPr>
+            <w:tcMar>
+              <w:top w:w="40" w:type="dxa"/>
+              <w:bottom w:w="40" w:type="dxa"/>
+            </w:tcMar>
+          </w:tcPr>
+          <w:p>
+            <w:pPr>
+              <w:spacing w:before="0" w:after="0" w:line="260" w:lineRule="exact"/>
               <w:jc w:val="left"/>
               <w:rPr>
                 <w:b/>
@@ -1605,9 +1578,14 @@
         <w:tc>
           <w:tcPr>
             <w:tcW w:w="1701" w:type="dxa"/>
-          </w:tcPr>
-          <w:p>
-            <w:pPr>
+            <w:tcMar>
+              <w:top w:w="40" w:type="dxa"/>
+              <w:bottom w:w="40" w:type="dxa"/>
+            </w:tcMar>
+          </w:tcPr>
+          <w:p>
+            <w:pPr>
+              <w:spacing w:before="0" w:after="0" w:line="260" w:lineRule="exact"/>
               <w:jc w:val="left"/>
               <w:rPr>
                 <w:b/>
@@ -1634,12 +1612,20 @@
             <w:right w:w="108" w:type="dxa"/>
           </w:tblCellMar>
         </w:tblPrEx>
+        <w:trPr>
+          <w:trHeight w:val="288" w:hRule="exact"/>
+        </w:trPr>
         <w:tc>
           <w:tcPr>
             <w:tcW w:w="817" w:type="dxa"/>
-          </w:tcPr>
-          <w:p>
-            <w:pPr>
+            <w:tcMar>
+              <w:top w:w="40" w:type="dxa"/>
+              <w:bottom w:w="40" w:type="dxa"/>
+            </w:tcMar>
+          </w:tcPr>
+          <w:p>
+            <w:pPr>
+              <w:spacing w:before="0" w:after="0" w:line="260" w:lineRule="exact"/>
               <w:jc w:val="center"/>
               <w:rPr>
                 <w:b/>
@@ -1647,8 +1633,9 @@
             </w:pPr>
             <w:r>
               <w:rPr>
-                <w:rFonts w:hint="eastAsia" w:eastAsia="Noto Sans CJK SC"/>
-                <w:b/>
+                <w:rFonts w:hint="eastAsia" w:eastAsia="Noto Sans CJK SC" w:ascii="Noto Sans CJK SC" w:hAnsi="Noto Sans CJK SC"/>
+                <w:b/>
+                <w:sz w:val="21"/>
               </w:rPr>
               <w:t>10</w:t>
             </w:r>
@@ -1657,9 +1644,14 @@
         <w:tc>
           <w:tcPr>
             <w:tcW w:w="1418" w:type="dxa"/>
-          </w:tcPr>
-          <w:p>
-            <w:pPr>
+            <w:tcMar>
+              <w:top w:w="40" w:type="dxa"/>
+              <w:bottom w:w="40" w:type="dxa"/>
+            </w:tcMar>
+          </w:tcPr>
+          <w:p>
+            <w:pPr>
+              <w:spacing w:before="0" w:after="0" w:line="260" w:lineRule="exact"/>
               <w:jc w:val="center"/>
               <w:rPr>
                 <w:b/>
@@ -1670,9 +1662,14 @@
         <w:tc>
           <w:tcPr>
             <w:tcW w:w="5032" w:type="dxa"/>
-          </w:tcPr>
-          <w:p>
-            <w:pPr>
+            <w:tcMar>
+              <w:top w:w="40" w:type="dxa"/>
+              <w:bottom w:w="40" w:type="dxa"/>
+            </w:tcMar>
+          </w:tcPr>
+          <w:p>
+            <w:pPr>
+              <w:spacing w:before="0" w:after="0" w:line="260" w:lineRule="exact"/>
               <w:jc w:val="left"/>
               <w:rPr>
                 <w:b/>
@@ -1685,9 +1682,14 @@
         <w:tc>
           <w:tcPr>
             <w:tcW w:w="5032" w:type="dxa"/>
-          </w:tcPr>
-          <w:p>
-            <w:pPr>
+            <w:tcMar>
+              <w:top w:w="40" w:type="dxa"/>
+              <w:bottom w:w="40" w:type="dxa"/>
+            </w:tcMar>
+          </w:tcPr>
+          <w:p>
+            <w:pPr>
+              <w:spacing w:before="0" w:after="0" w:line="260" w:lineRule="exact"/>
               <w:jc w:val="left"/>
               <w:rPr>
                 <w:b/>
@@ -1700,9 +1702,14 @@
         <w:tc>
           <w:tcPr>
             <w:tcW w:w="1701" w:type="dxa"/>
-          </w:tcPr>
-          <w:p>
-            <w:pPr>
+            <w:tcMar>
+              <w:top w:w="40" w:type="dxa"/>
+              <w:bottom w:w="40" w:type="dxa"/>
+            </w:tcMar>
+          </w:tcPr>
+          <w:p>
+            <w:pPr>
+              <w:spacing w:before="0" w:after="0" w:line="260" w:lineRule="exact"/>
               <w:jc w:val="left"/>
               <w:rPr>
                 <w:b/>
@@ -1736,9 +1743,14 @@
           <w:tcPr>
             <w:tcW w:w="14000" w:type="dxa"/>
             <w:gridSpan w:val="5"/>
-          </w:tcPr>
-          <w:p>
-            <w:pPr>
+            <w:tcMar>
+              <w:top w:w="40" w:type="dxa"/>
+              <w:bottom w:w="40" w:type="dxa"/>
+            </w:tcMar>
+          </w:tcPr>
+          <w:p>
+            <w:pPr>
+              <w:spacing w:before="0" w:after="0" w:line="260" w:lineRule="exact"/>
               <w:jc w:val="left"/>
               <w:rPr>
                 <w:b/>
@@ -1747,8 +1759,9 @@
             </w:pPr>
             <w:r>
               <w:rPr>
-                <w:rFonts w:hint="eastAsia" w:eastAsia="Noto Sans CJK SC"/>
-                <w:b/>
+                <w:rFonts w:hint="eastAsia" w:eastAsia="Noto Sans CJK SC" w:ascii="Noto Sans CJK SC" w:hAnsi="Noto Sans CJK SC"/>
+                <w:b/>
+                <w:sz w:val="21"/>
                 <w:szCs w:val="21"/>
               </w:rPr>
               <w:t>本学期工作总结：</w:t>
@@ -1760,6 +1773,7 @@
               <w:numPr>
                 <w:numId w:val="0"/>
               </w:numPr>
+              <w:spacing w:before="0" w:after="0" w:line="260" w:lineRule="exact"/>
               <w:ind w:leftChars="0"/>
               <w:jc w:val="left"/>
               <w:rPr>
@@ -1771,8 +1785,9 @@
             </w:pPr>
             <w:r>
               <w:rPr>
-                <w:rFonts w:hint="eastAsia" w:eastAsia="Noto Sans CJK SC"/>
-                <w:b/>
+                <w:rFonts w:hint="eastAsia" w:eastAsia="Noto Sans CJK SC" w:ascii="Noto Sans CJK SC" w:hAnsi="Noto Sans CJK SC"/>
+                <w:b/>
+                <w:sz w:val="21"/>
                 <w:szCs w:val="21"/>
                 <w:lang w:val="en-US" w:eastAsia="zh-CN"/>
               </w:rPr>
@@ -1785,6 +1800,7 @@
               <w:numPr>
                 <w:numId w:val="0"/>
               </w:numPr>
+              <w:spacing w:before="0" w:after="0" w:line="260" w:lineRule="exact"/>
               <w:ind w:leftChars="0"/>
               <w:jc w:val="left"/>
               <w:rPr>
@@ -1796,8 +1812,9 @@
             </w:pPr>
             <w:r>
               <w:rPr>
-                <w:rFonts w:hint="eastAsia" w:eastAsia="Noto Sans CJK SC"/>
-                <w:b/>
+                <w:rFonts w:hint="eastAsia" w:eastAsia="Noto Sans CJK SC" w:ascii="Noto Sans CJK SC" w:hAnsi="Noto Sans CJK SC"/>
+                <w:b/>
+                <w:sz w:val="21"/>
                 <w:szCs w:val="21"/>
                 <w:lang w:val="en-US" w:eastAsia="zh-CN"/>
               </w:rPr>
@@ -1810,6 +1827,7 @@
               <w:numPr>
                 <w:numId w:val="0"/>
               </w:numPr>
+              <w:spacing w:before="0" w:after="0" w:line="260" w:lineRule="exact"/>
               <w:ind w:leftChars="0"/>
               <w:jc w:val="left"/>
               <w:rPr>
@@ -1821,8 +1839,9 @@
             </w:pPr>
             <w:r>
               <w:rPr>
-                <w:rFonts w:hint="eastAsia" w:eastAsia="Noto Sans CJK SC"/>
-                <w:b/>
+                <w:rFonts w:hint="eastAsia" w:eastAsia="Noto Sans CJK SC" w:ascii="Noto Sans CJK SC" w:hAnsi="Noto Sans CJK SC"/>
+                <w:b/>
+                <w:sz w:val="21"/>
                 <w:szCs w:val="21"/>
                 <w:lang w:val="en-US" w:eastAsia="zh-CN"/>
               </w:rPr>
@@ -1845,7 +1864,7 @@
     </w:p>
     <w:sectPr>
       <w:pgSz w:w="16838" w:h="11906" w:orient="landscape"/>
-      <w:pgMar w:top="1800" w:right="1440" w:bottom="1800" w:left="1440" w:header="851" w:footer="992" w:gutter="0"/>
+      <w:pgMar w:top="432" w:right="1440" w:bottom="432" w:left="1440" w:header="851" w:footer="992" w:gutter="0"/>
       <w:cols w:space="425" w:num="1"/>
       <w:docGrid w:type="lines" w:linePitch="312" w:charSpace="0"/>
     </w:sectPr>

</xml_diff>

<commit_message>
docs: add function calling evaluation notes to weekly report
</commit_message>
<xml_diff>
--- a/2026秋-工作周报@姓名.docx
+++ b/2026秋-工作周报@姓名.docx
@@ -554,6 +554,19 @@
                 <w:sz w:val="21"/>
               </w:rPr>
               <w:t>重点梳理了两篇论文。GKD（Agarwal等，ICLR 2024，arXiv:2306.13649）在学生生成的序列上引入教师监督，缓解训练与推理阶段的数据分布差异，为本课题的在线采样流程提供了参考。MiniLLM（Gu等，ICLR 2024，arXiv:2306.08543）采用反向KL及相应优化方法，减少学生对教师低概率区域的不合理拟合，帮助明确了不同散度目标的比较思路。结合文献，将下一步重点放在Top-K反馈的信息损失分析及小规模验证上，模型训练尚未开展。</w:t>
+            </w:r>
+          </w:p>
+          <w:p>
+            <w:pPr>
+              <w:spacing w:before="0" w:after="0" w:line="260" w:lineRule="exact"/>
+            </w:pPr>
+            <w:r>
+              <w:rPr>
+                <w:rFonts w:ascii="Noto Sans CJK SC" w:hAnsi="Noto Sans CJK SC" w:eastAsia="Noto Sans CJK SC"/>
+                <w:b w:val="0"/>
+                <w:sz w:val="21"/>
+              </w:rPr>
+              <w:t>另外，查找了xLAM-60k等function calling训练数据集，并参考BFCL（Patil等，ICML 2025）的评测方法，初步考虑采用AST匹配准确率，并对具备执行条件的样例统计执行结果准确率。</w:t>
             </w:r>
           </w:p>
         </w:tc>

</xml_diff>

<commit_message>
docs: complete weekly report semester plan details
</commit_message>
<xml_diff>
--- a/2026秋-工作周报@姓名.docx
+++ b/2026秋-工作周报@姓名.docx
@@ -120,7 +120,7 @@
                 <w:szCs w:val="32"/>
                 <w:lang w:val="en-US" w:eastAsia="zh-CN"/>
               </w:rPr>
-              <w:t>姓名</w:t>
+              <w:t>张子琦</w:t>
             </w:r>
             <w:r>
               <w:rPr>
@@ -192,7 +192,7 @@
                 <w:b/>
                 <w:sz w:val="21"/>
               </w:rPr>
-              <w:t>1、</w:t>
+              <w:t>1、阅读知识蒸馏与函数调用相关文献，明确研究方案和评价指标。</w:t>
             </w:r>
           </w:p>
           <w:p>
@@ -212,7 +212,7 @@
                 <w:sz w:val="21"/>
                 <w:lang w:val="en-US" w:eastAsia="zh-CN"/>
               </w:rPr>
-              <w:t>2、</w:t>
+              <w:t>2、完成数据准备、训练环境搭建和SFT基线，开展在线策略蒸馏对照实验。</w:t>
             </w:r>
           </w:p>
           <w:p>
@@ -232,7 +232,7 @@
                 <w:sz w:val="21"/>
                 <w:lang w:val="en-US" w:eastAsia="zh-CN"/>
               </w:rPr>
-              <w:t>3、</w:t>
+              <w:t>3、整理实验结果与分析，完成毕业论文撰写和修改。</w:t>
             </w:r>
           </w:p>
         </w:tc>
@@ -470,7 +470,7 @@
                 <w:b/>
                 <w:sz w:val="21"/>
               </w:rPr>
-              <w:t>上周</w:t>
+              <w:t>1</w:t>
             </w:r>
           </w:p>
         </w:tc>
@@ -631,7 +631,7 @@
                 <w:b/>
                 <w:sz w:val="21"/>
               </w:rPr>
-              <w:t>本周</w:t>
+              <w:t>2</w:t>
             </w:r>
           </w:p>
         </w:tc>

</xml_diff>

<commit_message>
docs: align semester plan with project timeline
</commit_message>
<xml_diff>
--- a/2026秋-工作周报@姓名.docx
+++ b/2026秋-工作周报@姓名.docx
@@ -192,7 +192,7 @@
                 <w:b/>
                 <w:sz w:val="21"/>
               </w:rPr>
-              <w:t>1、阅读知识蒸馏与函数调用相关文献，明确研究方案和评价指标。</w:t>
+              <w:t>1、阅读相关文献，梳理函数调用训练数据集和评测指标，完成模型与数据的适配准备。</w:t>
             </w:r>
           </w:p>
           <w:p>
@@ -212,7 +212,7 @@
                 <w:sz w:val="21"/>
                 <w:lang w:val="en-US" w:eastAsia="zh-CN"/>
               </w:rPr>
-              <w:t>2、完成数据准备、训练环境搭建和SFT基线，开展在线策略蒸馏对照实验。</w:t>
+              <w:t>2、搭建训练与推理流程，完成SFT基线，打通学生生成、教师反馈与参数更新流程。</w:t>
             </w:r>
           </w:p>
           <w:p>
@@ -232,7 +232,7 @@
                 <w:sz w:val="21"/>
                 <w:lang w:val="en-US" w:eastAsia="zh-CN"/>
               </w:rPr>
-              <w:t>3、整理实验结果与分析，完成毕业论文撰写和修改。</w:t>
+              <w:t>3、实现蒸馏方法原型，开展数值和梯度等基础验证，整理配置与运行记录，为下学期正式实验做准备。</w:t>
             </w:r>
           </w:p>
         </w:tc>

</xml_diff>

<commit_message>
docs: align weekly report with calendar weeks
</commit_message>
<xml_diff>
--- a/2026秋-工作周报@姓名.docx
+++ b/2026秋-工作周报@姓名.docx
@@ -494,7 +494,7 @@
                 <w:b w:val="0"/>
                 <w:sz w:val="21"/>
               </w:rPr>
-              <w:t>2026.10.19—10.25</w:t>
+              <w:t>2026.10.12—10.18</w:t>
             </w:r>
           </w:p>
         </w:tc>
@@ -517,7 +517,7 @@
                 <w:b/>
                 <w:sz w:val="21"/>
               </w:rPr>
-              <w:t>上周工作情况</w:t>
+              <w:t>第1周工作情况</w:t>
             </w:r>
           </w:p>
           <w:p>
@@ -553,20 +553,7 @@
                 <w:b w:val="0"/>
                 <w:sz w:val="21"/>
               </w:rPr>
-              <w:t>重点梳理了两篇论文。GKD（Agarwal等，ICLR 2024，arXiv:2306.13649）在学生生成的序列上引入教师监督，缓解训练与推理阶段的数据分布差异，为本课题的在线采样流程提供了参考。MiniLLM（Gu等，ICLR 2024，arXiv:2306.08543）采用反向KL及相应优化方法，减少学生对教师低概率区域的不合理拟合，帮助明确了不同散度目标的比较思路。结合文献，将下一步重点放在Top-K反馈的信息损失分析及小规模验证上，模型训练尚未开展。</w:t>
-            </w:r>
-          </w:p>
-          <w:p>
-            <w:pPr>
-              <w:spacing w:before="0" w:after="0" w:line="260" w:lineRule="exact"/>
-            </w:pPr>
-            <w:r>
-              <w:rPr>
-                <w:rFonts w:ascii="Noto Sans CJK SC" w:hAnsi="Noto Sans CJK SC" w:eastAsia="Noto Sans CJK SC"/>
-                <w:b w:val="0"/>
-                <w:sz w:val="21"/>
-              </w:rPr>
-              <w:t>另外，查找了xLAM-60k等function calling训练数据集，并参考BFCL（Patil等，ICML 2025）的评测方法，初步考虑采用AST匹配准确率，并对具备执行条件的样例统计执行结果准确率。</w:t>
+              <w:t>阅读GKD（Agarwal等，ICLR 2024，arXiv:2306.13649）和MiniLLM（Gu等，ICLR 2024，arXiv:2306.08543），前者利用学生生成序列上的教师监督缓解训练与推理分布差异，后者以反向KL改善分布匹配，为在线采样及散度目标设计提供参考。同时查找xLAM-60k训练集，参考BFCL（Patil等，ICML 2025）梳理AST匹配准确率及可执行样例的执行结果准确率。</w:t>
             </w:r>
           </w:p>
         </w:tc>
@@ -655,7 +642,7 @@
                 <w:b w:val="0"/>
                 <w:sz w:val="21"/>
               </w:rPr>
-              <w:t>2026.10.26—11.01</w:t>
+              <w:t>2026.10.19—10.25</w:t>
             </w:r>
           </w:p>
         </w:tc>
@@ -678,7 +665,7 @@
                 <w:b/>
                 <w:sz w:val="21"/>
               </w:rPr>
-              <w:t>本周计划</w:t>
+              <w:t>第2周工作计划</w:t>
             </w:r>
           </w:p>
           <w:p>
@@ -691,7 +678,7 @@
                 <w:b w:val="0"/>
                 <w:sz w:val="21"/>
               </w:rPr>
-              <w:t>选择合适的模型，准备训练环境和数据，先完成监督微调（SFT），建立后续蒸馏实验的基线。</w:t>
+              <w:t>梳理函数调用样本的输入输出格式，了解SFT数据处理和训练流程，明确基线实验需要准备的模型、数据与运行环境。</w:t>
             </w:r>
           </w:p>
         </w:tc>
@@ -714,7 +701,7 @@
                 <w:b w:val="0"/>
                 <w:sz w:val="21"/>
               </w:rPr>
-              <w:t>正在进行</w:t>
+              <w:t>查看了xLAM-60k中的query、tools和answers等字段，梳理用户问题、工具定义和目标函数调用之间的对应关系；了解函数调用样本转换为训练对话格式的处理方式，并整理训练集与评测集划分、工具调用格式等注意事项，作为后续SFT基线的准备。模型训练尚未开始。</w:t>
             </w:r>
           </w:p>
         </w:tc>
@@ -737,7 +724,7 @@
                 <w:b w:val="0"/>
                 <w:sz w:val="21"/>
               </w:rPr>
-              <w:t>近期需准备学术会议材料，训练与基线验证进度有所延后。</w:t>
+              <w:t>数据格式和训练环境仍需核对，暂未开展模型训练。</w:t>
             </w:r>
           </w:p>
         </w:tc>
@@ -759,9 +746,7 @@
             <w:right w:w="108" w:type="dxa"/>
           </w:tblCellMar>
         </w:tblPrEx>
-        <w:trPr>
-          <w:trHeight w:val="288" w:hRule="exact"/>
-        </w:trPr>
+        <w:trPr/>
         <w:tc>
           <w:tcPr>
             <w:tcW w:w="817" w:type="dxa"/>
@@ -774,13 +759,10 @@
             <w:pPr>
               <w:spacing w:before="0" w:after="0" w:line="260" w:lineRule="exact"/>
               <w:jc w:val="center"/>
-              <w:rPr>
-                <w:b/>
-              </w:rPr>
-            </w:pPr>
-            <w:r>
-              <w:rPr>
-                <w:rFonts w:hint="eastAsia" w:eastAsia="Noto Sans CJK SC" w:ascii="Noto Sans CJK SC" w:hAnsi="Noto Sans CJK SC"/>
+            </w:pPr>
+            <w:r>
+              <w:rPr>
+                <w:rFonts w:ascii="Noto Sans CJK SC" w:hAnsi="Noto Sans CJK SC" w:eastAsia="Noto Sans CJK SC"/>
                 <w:b/>
                 <w:sz w:val="21"/>
               </w:rPr>
@@ -800,10 +782,15 @@
             <w:pPr>
               <w:spacing w:before="0" w:after="0" w:line="260" w:lineRule="exact"/>
               <w:jc w:val="center"/>
-              <w:rPr>
-                <w:b/>
-              </w:rPr>
-            </w:pPr>
+            </w:pPr>
+            <w:r>
+              <w:rPr>
+                <w:rFonts w:ascii="Noto Sans CJK SC" w:hAnsi="Noto Sans CJK SC" w:eastAsia="Noto Sans CJK SC"/>
+                <w:b w:val="0"/>
+                <w:sz w:val="21"/>
+              </w:rPr>
+              <w:t>2026.10.26—11.01</w:t>
+            </w:r>
           </w:p>
         </w:tc>
         <w:tc>
@@ -817,13 +804,28 @@
           <w:p>
             <w:pPr>
               <w:spacing w:before="0" w:after="0" w:line="260" w:lineRule="exact"/>
-              <w:jc w:val="left"/>
-              <w:rPr>
-                <w:b/>
-                <w:sz w:val="18"/>
-                <w:szCs w:val="18"/>
-              </w:rPr>
-            </w:pPr>
+            </w:pPr>
+            <w:r>
+              <w:rPr>
+                <w:rFonts w:ascii="Noto Sans CJK SC" w:hAnsi="Noto Sans CJK SC" w:eastAsia="Noto Sans CJK SC"/>
+                <w:b/>
+                <w:sz w:val="21"/>
+              </w:rPr>
+              <w:t>本周计划</w:t>
+            </w:r>
+          </w:p>
+          <w:p>
+            <w:pPr>
+              <w:spacing w:before="0" w:after="0" w:line="260" w:lineRule="exact"/>
+            </w:pPr>
+            <w:r>
+              <w:rPr>
+                <w:rFonts w:ascii="Noto Sans CJK SC" w:hAnsi="Noto Sans CJK SC" w:eastAsia="Noto Sans CJK SC"/>
+                <w:b w:val="0"/>
+                <w:sz w:val="21"/>
+              </w:rPr>
+              <w:t>选择合适的模型，准备训练环境和数据，先完成监督微调（SFT），建立后续蒸馏实验的基线。</w:t>
+            </w:r>
           </w:p>
         </w:tc>
         <w:tc>
@@ -837,13 +839,15 @@
           <w:p>
             <w:pPr>
               <w:spacing w:before="0" w:after="0" w:line="260" w:lineRule="exact"/>
-              <w:jc w:val="left"/>
-              <w:rPr>
-                <w:b/>
-                <w:sz w:val="18"/>
-                <w:szCs w:val="18"/>
-              </w:rPr>
-            </w:pPr>
+            </w:pPr>
+            <w:r>
+              <w:rPr>
+                <w:rFonts w:ascii="Noto Sans CJK SC" w:hAnsi="Noto Sans CJK SC" w:eastAsia="Noto Sans CJK SC"/>
+                <w:b w:val="0"/>
+                <w:sz w:val="21"/>
+              </w:rPr>
+              <w:t>正在进行</w:t>
+            </w:r>
           </w:p>
         </w:tc>
         <w:tc>
@@ -857,12 +861,15 @@
           <w:p>
             <w:pPr>
               <w:spacing w:before="0" w:after="0" w:line="260" w:lineRule="exact"/>
-              <w:jc w:val="left"/>
-              <w:rPr>
-                <w:b/>
-                <w:szCs w:val="21"/>
-              </w:rPr>
-            </w:pPr>
+            </w:pPr>
+            <w:r>
+              <w:rPr>
+                <w:rFonts w:ascii="Noto Sans CJK SC" w:hAnsi="Noto Sans CJK SC" w:eastAsia="Noto Sans CJK SC"/>
+                <w:b w:val="0"/>
+                <w:sz w:val="21"/>
+              </w:rPr>
+              <w:t>近期需准备学术会议材料，训练与基线验证进度有所延后。</w:t>
+            </w:r>
           </w:p>
         </w:tc>
       </w:tr>

</xml_diff>

<commit_message>
docs: mark prior weeks as largely complete
</commit_message>
<xml_diff>
--- a/2026秋-工作周报@姓名.docx
+++ b/2026秋-工作周报@姓名.docx
@@ -576,7 +576,7 @@
                 <w:b w:val="0"/>
                 <w:sz w:val="21"/>
               </w:rPr>
-              <w:t>近期同时准备另一篇论文，实验投入时间不足，训练与验证进度有所延后。</w:t>
+              <w:t>大致完成</w:t>
             </w:r>
           </w:p>
         </w:tc>
@@ -724,7 +724,7 @@
                 <w:b w:val="0"/>
                 <w:sz w:val="21"/>
               </w:rPr>
-              <w:t>数据格式和训练环境仍需核对，暂未开展模型训练。</w:t>
+              <w:t>大致完成</w:t>
             </w:r>
           </w:p>
         </w:tc>

</xml_diff>